<commit_message>
Add the presentation deck design and fix report coverage notes
Co-Authored-By: Claude Fable 5.1 <noreply@anthropic.com>
</commit_message>
<xml_diff>
--- a/文档/Project10_Written_Report_Draft_EN.docx
+++ b/文档/Project10_Written_Report_Draft_EN.docx
@@ -81,7 +81,7 @@
         </w:rPr>
         <w:fldChar w:fldCharType="separate"/>
       </w:r>
-      <w:hyperlink w:anchor="_Toc243236490" w:history="1">
+      <w:hyperlink w:anchor="_Toc243237713" w:history="1">
         <w:r>
           <w:rPr>
             <w:rStyle w:val="aff9"/>
@@ -119,7 +119,7 @@
             <w:noProof/>
             <w:webHidden/>
           </w:rPr>
-          <w:instrText>PAGEREF _Toc243236490 \h</w:instrText>
+          <w:instrText>PAGEREF _Toc243237713 \h</w:instrText>
         </w:r>
         <w:r>
           <w:rPr>
@@ -177,7 +177,7 @@
           <w14:ligatures w14:val="standardContextual"/>
         </w:rPr>
       </w:pPr>
-      <w:hyperlink w:anchor="_Toc243236491" w:history="1">
+      <w:hyperlink w:anchor="_Toc243237714" w:history="1">
         <w:r>
           <w:rPr>
             <w:rStyle w:val="aff9"/>
@@ -215,7 +215,7 @@
             <w:noProof/>
             <w:webHidden/>
           </w:rPr>
-          <w:instrText>PAGEREF _Toc243236491 \h</w:instrText>
+          <w:instrText>PAGEREF _Toc243237714 \h</w:instrText>
         </w:r>
         <w:r>
           <w:rPr>
@@ -273,7 +273,7 @@
           <w14:ligatures w14:val="standardContextual"/>
         </w:rPr>
       </w:pPr>
-      <w:hyperlink w:anchor="_Toc243236492" w:history="1">
+      <w:hyperlink w:anchor="_Toc243237715" w:history="1">
         <w:r>
           <w:rPr>
             <w:rStyle w:val="aff9"/>
@@ -311,7 +311,7 @@
             <w:noProof/>
             <w:webHidden/>
           </w:rPr>
-          <w:instrText>PAGEREF _Toc243236492 \h</w:instrText>
+          <w:instrText>PAGEREF _Toc243237715 \h</w:instrText>
         </w:r>
         <w:r>
           <w:rPr>
@@ -369,7 +369,7 @@
           <w14:ligatures w14:val="standardContextual"/>
         </w:rPr>
       </w:pPr>
-      <w:hyperlink w:anchor="_Toc243236493" w:history="1">
+      <w:hyperlink w:anchor="_Toc243237716" w:history="1">
         <w:r>
           <w:rPr>
             <w:rStyle w:val="aff9"/>
@@ -407,7 +407,7 @@
             <w:noProof/>
             <w:webHidden/>
           </w:rPr>
-          <w:instrText>PAGEREF _Toc243236493 \h</w:instrText>
+          <w:instrText>PAGEREF _Toc243237716 \h</w:instrText>
         </w:r>
         <w:r>
           <w:rPr>
@@ -466,7 +466,7 @@
           <w14:ligatures w14:val="standardContextual"/>
         </w:rPr>
       </w:pPr>
-      <w:hyperlink w:anchor="_Toc243236494" w:history="1">
+      <w:hyperlink w:anchor="_Toc243237717" w:history="1">
         <w:r>
           <w:rPr>
             <w:rStyle w:val="aff9"/>
@@ -504,7 +504,7 @@
             <w:noProof/>
             <w:webHidden/>
           </w:rPr>
-          <w:instrText>PAGEREF _Toc243236494 \h</w:instrText>
+          <w:instrText>PAGEREF _Toc243237717 \h</w:instrText>
         </w:r>
         <w:r>
           <w:rPr>
@@ -563,7 +563,7 @@
           <w14:ligatures w14:val="standardContextual"/>
         </w:rPr>
       </w:pPr>
-      <w:hyperlink w:anchor="_Toc243236495" w:history="1">
+      <w:hyperlink w:anchor="_Toc243237718" w:history="1">
         <w:r>
           <w:rPr>
             <w:rStyle w:val="aff9"/>
@@ -601,7 +601,7 @@
             <w:noProof/>
             <w:webHidden/>
           </w:rPr>
-          <w:instrText>PAGEREF _Toc243236495 \h</w:instrText>
+          <w:instrText>PAGEREF _Toc243237718 \h</w:instrText>
         </w:r>
         <w:r>
           <w:rPr>
@@ -660,7 +660,7 @@
           <w14:ligatures w14:val="standardContextual"/>
         </w:rPr>
       </w:pPr>
-      <w:hyperlink w:anchor="_Toc243236496" w:history="1">
+      <w:hyperlink w:anchor="_Toc243237719" w:history="1">
         <w:r>
           <w:rPr>
             <w:rStyle w:val="aff9"/>
@@ -698,7 +698,7 @@
             <w:noProof/>
             <w:webHidden/>
           </w:rPr>
-          <w:instrText>PAGEREF _Toc243236496 \h</w:instrText>
+          <w:instrText>PAGEREF _Toc243237719 \h</w:instrText>
         </w:r>
         <w:r>
           <w:rPr>
@@ -757,7 +757,7 @@
           <w14:ligatures w14:val="standardContextual"/>
         </w:rPr>
       </w:pPr>
-      <w:hyperlink w:anchor="_Toc243236497" w:history="1">
+      <w:hyperlink w:anchor="_Toc243237720" w:history="1">
         <w:r>
           <w:rPr>
             <w:rStyle w:val="aff9"/>
@@ -795,7 +795,7 @@
             <w:noProof/>
             <w:webHidden/>
           </w:rPr>
-          <w:instrText>PAGEREF _Toc243236497 \h</w:instrText>
+          <w:instrText>PAGEREF _Toc243237720 \h</w:instrText>
         </w:r>
         <w:r>
           <w:rPr>
@@ -853,7 +853,7 @@
           <w14:ligatures w14:val="standardContextual"/>
         </w:rPr>
       </w:pPr>
-      <w:hyperlink w:anchor="_Toc243236498" w:history="1">
+      <w:hyperlink w:anchor="_Toc243237721" w:history="1">
         <w:r>
           <w:rPr>
             <w:rStyle w:val="aff9"/>
@@ -891,7 +891,7 @@
             <w:noProof/>
             <w:webHidden/>
           </w:rPr>
-          <w:instrText>PAGEREF _Toc243236498 \h</w:instrText>
+          <w:instrText>PAGEREF _Toc243237721 \h</w:instrText>
         </w:r>
         <w:r>
           <w:rPr>
@@ -949,7 +949,7 @@
           <w14:ligatures w14:val="standardContextual"/>
         </w:rPr>
       </w:pPr>
-      <w:hyperlink w:anchor="_Toc243236499" w:history="1">
+      <w:hyperlink w:anchor="_Toc243237722" w:history="1">
         <w:r>
           <w:rPr>
             <w:rStyle w:val="aff9"/>
@@ -987,7 +987,7 @@
             <w:noProof/>
             <w:webHidden/>
           </w:rPr>
-          <w:instrText>PAGEREF _Toc243236499 \h</w:instrText>
+          <w:instrText>PAGEREF _Toc243237722 \h</w:instrText>
         </w:r>
         <w:r>
           <w:rPr>
@@ -1046,7 +1046,7 @@
           <w14:ligatures w14:val="standardContextual"/>
         </w:rPr>
       </w:pPr>
-      <w:hyperlink w:anchor="_Toc243236500" w:history="1">
+      <w:hyperlink w:anchor="_Toc243237723" w:history="1">
         <w:r>
           <w:rPr>
             <w:rStyle w:val="aff9"/>
@@ -1084,7 +1084,7 @@
             <w:noProof/>
             <w:webHidden/>
           </w:rPr>
-          <w:instrText>PAGEREF _Toc243236500 \h</w:instrText>
+          <w:instrText>PAGEREF _Toc243237723 \h</w:instrText>
         </w:r>
         <w:r>
           <w:rPr>
@@ -1143,7 +1143,7 @@
           <w14:ligatures w14:val="standardContextual"/>
         </w:rPr>
       </w:pPr>
-      <w:hyperlink w:anchor="_Toc243236501" w:history="1">
+      <w:hyperlink w:anchor="_Toc243237724" w:history="1">
         <w:r>
           <w:rPr>
             <w:rStyle w:val="aff9"/>
@@ -1181,7 +1181,7 @@
             <w:noProof/>
             <w:webHidden/>
           </w:rPr>
-          <w:instrText>PAGEREF _Toc243236501 \h</w:instrText>
+          <w:instrText>PAGEREF _Toc243237724 \h</w:instrText>
         </w:r>
         <w:r>
           <w:rPr>
@@ -1240,7 +1240,7 @@
           <w14:ligatures w14:val="standardContextual"/>
         </w:rPr>
       </w:pPr>
-      <w:hyperlink w:anchor="_Toc243236502" w:history="1">
+      <w:hyperlink w:anchor="_Toc243237725" w:history="1">
         <w:r>
           <w:rPr>
             <w:rStyle w:val="aff9"/>
@@ -1278,7 +1278,7 @@
             <w:noProof/>
             <w:webHidden/>
           </w:rPr>
-          <w:instrText>PAGEREF _Toc243236502 \h</w:instrText>
+          <w:instrText>PAGEREF _Toc243237725 \h</w:instrText>
         </w:r>
         <w:r>
           <w:rPr>
@@ -1337,7 +1337,7 @@
           <w14:ligatures w14:val="standardContextual"/>
         </w:rPr>
       </w:pPr>
-      <w:hyperlink w:anchor="_Toc243236503" w:history="1">
+      <w:hyperlink w:anchor="_Toc243237726" w:history="1">
         <w:r>
           <w:rPr>
             <w:rStyle w:val="aff9"/>
@@ -1375,7 +1375,7 @@
             <w:noProof/>
             <w:webHidden/>
           </w:rPr>
-          <w:instrText>PAGEREF _Toc243236503 \h</w:instrText>
+          <w:instrText>PAGEREF _Toc243237726 \h</w:instrText>
         </w:r>
         <w:r>
           <w:rPr>
@@ -1433,7 +1433,7 @@
           <w14:ligatures w14:val="standardContextual"/>
         </w:rPr>
       </w:pPr>
-      <w:hyperlink w:anchor="_Toc243236504" w:history="1">
+      <w:hyperlink w:anchor="_Toc243237727" w:history="1">
         <w:r>
           <w:rPr>
             <w:rStyle w:val="aff9"/>
@@ -1471,7 +1471,7 @@
             <w:noProof/>
             <w:webHidden/>
           </w:rPr>
-          <w:instrText>PAGEREF _Toc243236504 \h</w:instrText>
+          <w:instrText>PAGEREF _Toc243237727 \h</w:instrText>
         </w:r>
         <w:r>
           <w:rPr>
@@ -1529,7 +1529,7 @@
           <w14:ligatures w14:val="standardContextual"/>
         </w:rPr>
       </w:pPr>
-      <w:hyperlink w:anchor="_Toc243236505" w:history="1">
+      <w:hyperlink w:anchor="_Toc243237728" w:history="1">
         <w:r>
           <w:rPr>
             <w:rStyle w:val="aff9"/>
@@ -1567,7 +1567,7 @@
             <w:noProof/>
             <w:webHidden/>
           </w:rPr>
-          <w:instrText>PAGEREF _Toc243236505 \h</w:instrText>
+          <w:instrText>PAGEREF _Toc243237728 \h</w:instrText>
         </w:r>
         <w:r>
           <w:rPr>
@@ -1625,7 +1625,7 @@
           <w14:ligatures w14:val="standardContextual"/>
         </w:rPr>
       </w:pPr>
-      <w:hyperlink w:anchor="_Toc243236506" w:history="1">
+      <w:hyperlink w:anchor="_Toc243237729" w:history="1">
         <w:r>
           <w:rPr>
             <w:rStyle w:val="aff9"/>
@@ -1663,7 +1663,7 @@
             <w:noProof/>
             <w:webHidden/>
           </w:rPr>
-          <w:instrText>PAGEREF _Toc243236506 \h</w:instrText>
+          <w:instrText>PAGEREF _Toc243237729 \h</w:instrText>
         </w:r>
         <w:r>
           <w:rPr>
@@ -1721,7 +1721,7 @@
           <w14:ligatures w14:val="standardContextual"/>
         </w:rPr>
       </w:pPr>
-      <w:hyperlink w:anchor="_Toc243236507" w:history="1">
+      <w:hyperlink w:anchor="_Toc243237730" w:history="1">
         <w:r>
           <w:rPr>
             <w:rStyle w:val="aff9"/>
@@ -1759,7 +1759,7 @@
             <w:noProof/>
             <w:webHidden/>
           </w:rPr>
-          <w:instrText>PAGEREF _Toc243236507 \h</w:instrText>
+          <w:instrText>PAGEREF _Toc243237730 \h</w:instrText>
         </w:r>
         <w:r>
           <w:rPr>
@@ -1817,7 +1817,7 @@
           <w14:ligatures w14:val="standardContextual"/>
         </w:rPr>
       </w:pPr>
-      <w:hyperlink w:anchor="_Toc243236508" w:history="1">
+      <w:hyperlink w:anchor="_Toc243237731" w:history="1">
         <w:r>
           <w:rPr>
             <w:rStyle w:val="aff9"/>
@@ -1855,7 +1855,7 @@
             <w:noProof/>
             <w:webHidden/>
           </w:rPr>
-          <w:instrText>PAGEREF _Toc243236508 \h</w:instrText>
+          <w:instrText>PAGEREF _Toc243237731 \h</w:instrText>
         </w:r>
         <w:r>
           <w:rPr>
@@ -1913,7 +1913,7 @@
           <w14:ligatures w14:val="standardContextual"/>
         </w:rPr>
       </w:pPr>
-      <w:hyperlink w:anchor="_Toc243236509" w:history="1">
+      <w:hyperlink w:anchor="_Toc243237732" w:history="1">
         <w:r>
           <w:rPr>
             <w:rStyle w:val="aff9"/>
@@ -1951,7 +1951,7 @@
             <w:noProof/>
             <w:webHidden/>
           </w:rPr>
-          <w:instrText>PAGEREF _Toc243236509 \h</w:instrText>
+          <w:instrText>PAGEREF _Toc243237732 \h</w:instrText>
         </w:r>
         <w:r>
           <w:rPr>
@@ -2009,7 +2009,7 @@
           <w14:ligatures w14:val="standardContextual"/>
         </w:rPr>
       </w:pPr>
-      <w:hyperlink w:anchor="_Toc243236510" w:history="1">
+      <w:hyperlink w:anchor="_Toc243237733" w:history="1">
         <w:r>
           <w:rPr>
             <w:rStyle w:val="aff9"/>
@@ -2047,7 +2047,7 @@
             <w:noProof/>
             <w:webHidden/>
           </w:rPr>
-          <w:instrText>PAGEREF _Toc243236510 \h</w:instrText>
+          <w:instrText>PAGEREF _Toc243237733 \h</w:instrText>
         </w:r>
         <w:r>
           <w:rPr>
@@ -2102,7 +2102,7 @@
         <w:pStyle w:val="1"/>
         <w:spacing w:before="280" w:after="120"/>
       </w:pPr>
-      <w:bookmarkStart w:id="0" w:name="_Toc243236490"/>
+      <w:bookmarkStart w:id="0" w:name="_Toc243237713"/>
       <w:r>
         <w:rPr>
           <w:rFonts w:ascii="Times New Roman" w:eastAsia="Arial" w:hAnsi="Times New Roman"/>
@@ -2119,13 +2119,7 @@
         <w:rPr>
           <w:color w:val="000000"/>
         </w:rPr>
-        <w:t xml:space="preserve">This paper examines whether investors follow star analysts because stars are more accurate or because their status commands attention. Using 20,980 recommendation revisions for Chinese A-shares from 2018 to 2024, it compares announcement returns and abnormal volume, post-announcement drift, and ex post accuracy between star and non-star analysts. Star upgrades generate a larger market-adjusted announcement return (0.37 percentage points over [-1,+1], t = 2.17) and higher abnormal volume; star downgrades do </w:t>
-      </w:r>
-      <w:r>
-        <w:rPr>
-          <w:color w:val="000000"/>
-        </w:rPr>
-        <w:t>not. The upgrade premium is concentrated in events with a price-limit hit. Star downgrades are followed by short-run underperformance (1.64 percentage points over +2 to +60, p = 0.002) and later reversal, whereas star upgrades show no differential drift. Holding-period returns favour stars only at short horizons, and star analysts' absolute earnings forecast errors are larger. The evidence is more consistent with influence than with a stable information advantage.</w:t>
+        <w:t>This paper examines whether investors follow star analysts because stars are more accurate or because their status commands attention. Using 20,980 recommendation revisions for Chinese A-shares from 2018 to 2024, it compares announcement returns and abnormal volume, post-announcement drift, and ex post accuracy between star and non-star analysts. Star upgrades generate a larger market-adjusted announcement return (0.37 percentage points over [-1,+1], t = 2.17) and higher abnormal volume; star downgrades do not. The upgrade premium is concentrated in events with a price-limit hit. Star downgrades are followed by short-run underperformance (1.64 percentage points over +2 to +60, p = 0.002) and later reversal, whereas star upgrades show no differential drift. Holding-period returns favour stars only at short horizons, and star analysts' absolute earnings forecast errors are larger. The evidence is more consistent with influence than with a stable information advantage.</w:t>
       </w:r>
     </w:p>
     <w:p>
@@ -2133,7 +2127,7 @@
         <w:pStyle w:val="1"/>
         <w:spacing w:before="280" w:after="120"/>
       </w:pPr>
-      <w:bookmarkStart w:id="1" w:name="_Toc243236491"/>
+      <w:bookmarkStart w:id="1" w:name="_Toc243237714"/>
       <w:r>
         <w:rPr>
           <w:rFonts w:ascii="Times New Roman" w:eastAsia="Arial" w:hAnsi="Times New Roman"/>
@@ -2149,13 +2143,7 @@
         <w:rPr>
           <w:color w:val="000000"/>
         </w:rPr>
-        <w:t>Authority can shape decisions against private information (Milgram, 1963). This paper asks whether the same mechanism operates in financial markets. When a star analyst changes a recommendation, does the market respond to the information in the revision, or to the analyst's status? The distinction matters because sell-side research is valuable only if reputation tracks accuracy. If star status generates a price response that is not matched by superior forecasts, investors are paying for status rather than i</w:t>
-      </w:r>
-      <w:r>
-        <w:rPr>
-          <w:color w:val="000000"/>
-        </w:rPr>
-        <w:t>nformation.</w:t>
+        <w:t>Authority can shape decisions against private information (Milgram, 1963). This paper asks whether the same mechanism operates in financial markets. When a star analyst changes a recommendation, does the market respond to the information in the revision, or to the analyst's status? The distinction matters because sell-side research is valuable only if reputation tracks accuracy. If star status generates a price response that is not matched by superior forecasts, investors are paying for status rather than information.</w:t>
       </w:r>
     </w:p>
     <w:p>
@@ -2179,7 +2167,7 @@
         <w:pStyle w:val="1"/>
         <w:spacing w:before="280" w:after="120"/>
       </w:pPr>
-      <w:bookmarkStart w:id="2" w:name="_Toc243236492"/>
+      <w:bookmarkStart w:id="2" w:name="_Toc243237715"/>
       <w:r>
         <w:rPr>
           <w:rFonts w:ascii="Times New Roman" w:eastAsia="Arial" w:hAnsi="Times New Roman"/>
@@ -2195,13 +2183,7 @@
         <w:rPr>
           <w:color w:val="000000"/>
         </w:rPr>
-        <w:t>The information explanation holds that star analysts have better access, larger teams and stronger skills. Their revisions should convey more news, produce larger announcement reactions, and be followed by returns in the recommended direction. The influence explanation holds that status itself is the source of authority. Investors react to the label, not only to the content, so the announcement reaction can be large even when the forecast is not more accurate. Because attention is temporary, the initial pri</w:t>
-      </w:r>
-      <w:r>
-        <w:rPr>
-          <w:color w:val="000000"/>
-        </w:rPr>
-        <w:t>ce impact may later reverse.</w:t>
+        <w:t>The information explanation holds that star analysts have better access, larger teams and stronger skills. Their revisions should convey more news, produce larger announcement reactions, and be followed by returns in the recommended direction. The influence explanation holds that status itself is the source of authority. Investors react to the label, not only to the content, so the announcement reaction can be large even when the forecast is not more accurate. Because attention is temporary, the initial price impact may later reverse.</w:t>
       </w:r>
     </w:p>
     <w:p>
@@ -2209,13 +2191,7 @@
         <w:rPr>
           <w:color w:val="000000"/>
         </w:rPr>
-        <w:t>Both explanations predict a larger announcement reaction, so announcement-window tests alone cannot separate them. Prior work uses three additional margins. Stickel (1992) relates reputation to forecast accuracy and market impact. Bonner, Hugon and Walther (2007) show that celebrity status affects the reaction to earnings forecast revisions. Loh and Stulz (2011) ask when recommendation changes are influential, while Fang and Yasuda (2009, 2014) examine whether reputation disciplines research and whether sta</w:t>
-      </w:r>
-      <w:r>
-        <w:rPr>
-          <w:color w:val="000000"/>
-        </w:rPr>
-        <w:t xml:space="preserve">r opinions are worth more. Chinese evidence in </w:t>
+        <w:t xml:space="preserve">Both explanations predict a larger announcement reaction, so announcement-window tests alone cannot separate them. Prior work uses three additional margins. Stickel (1992) relates reputation to forecast accuracy and market impact. Bonner, Hugon and Walther (2007) show that celebrity status affects the reaction to earnings forecast revisions. Loh and Stulz (2011) ask when recommendation changes are influential, while Fang and Yasuda (2009, 2014) examine whether reputation disciplines research and whether star opinions are worth more. Chinese evidence in </w:t>
       </w:r>
       <w:r>
         <w:rPr>
@@ -2327,7 +2303,7 @@
         <w:pStyle w:val="1"/>
         <w:spacing w:before="280" w:after="120"/>
       </w:pPr>
-      <w:bookmarkStart w:id="3" w:name="_Toc243236493"/>
+      <w:bookmarkStart w:id="3" w:name="_Toc243237716"/>
       <w:r>
         <w:rPr>
           <w:rFonts w:ascii="Times New Roman" w:eastAsia="Arial" w:hAnsi="Times New Roman"/>
@@ -2343,7 +2319,7 @@
         <w:pStyle w:val="21"/>
         <w:spacing w:after="120"/>
       </w:pPr>
-      <w:bookmarkStart w:id="4" w:name="_Toc243236494"/>
+      <w:bookmarkStart w:id="4" w:name="_Toc243237717"/>
       <w:r>
         <w:rPr>
           <w:rFonts w:ascii="Times New Roman" w:eastAsia="Arial" w:hAnsi="Times New Roman"/>
@@ -2460,7 +2436,7 @@
         <w:pStyle w:val="21"/>
         <w:spacing w:after="120"/>
       </w:pPr>
-      <w:bookmarkStart w:id="5" w:name="_Toc243236495"/>
+      <w:bookmarkStart w:id="5" w:name="_Toc243237718"/>
       <w:r>
         <w:rPr>
           <w:rFonts w:ascii="Times New Roman" w:eastAsia="Arial" w:hAnsi="Times New Roman"/>
@@ -2887,7 +2863,7 @@
         <w:pStyle w:val="21"/>
         <w:spacing w:after="120"/>
       </w:pPr>
-      <w:bookmarkStart w:id="6" w:name="_Toc243236496"/>
+      <w:bookmarkStart w:id="6" w:name="_Toc243237719"/>
       <w:r>
         <w:rPr>
           <w:rFonts w:ascii="Times New Roman" w:eastAsia="Arial" w:hAnsi="Times New Roman"/>
@@ -2923,13 +2899,7 @@
         <w:rPr>
           <w:color w:val="000000"/>
         </w:rPr>
-        <w:t xml:space="preserve"> equals one if the analyst appears in the New Fortune Best Analyst list for the event year. The 2018 vote was suspended, and the page labelled 2018 is a compilation of anniversary awards rather than an annual industry ranking. It is excluded, and 2018 events inherit the 2017 list, which was the list in force during 2018. The evidence is that 34.7% of the 2018 page's names appear in no other year, against 8.1-17.7% for 2019-2023; its name overlap with 2019 is Jaccard 0.10, against 0.42-0.52 for other adjacen</w:t>
-      </w:r>
-      <w:r>
-        <w:rPr>
-          <w:color w:val="000000"/>
-        </w:rPr>
-        <w:t xml:space="preserve">t pairs; and it matches only 4.0% of that year's events under the name-and-broker rule, against 12.1-14.0% for other list years. The in-force rule restores 2018 to 13.4%. Across the sample, 2,774 events (13.2%) have </w:t>
+        <w:t xml:space="preserve"> equals one if the analyst appears in the New Fortune Best Analyst list for the event year. The 2018 vote was suspended, and the page labelled 2018 is a compilation of anniversary awards rather than an annual industry ranking. It is excluded, and 2018 events inherit the 2017 list, which was the list in force during 2018. The evidence is that 34.7% of the 2018 page's names appear in no other year, against 8.1-17.7% for 2019-2023; its name overlap with 2019 is Jaccard 0.10, against 0.42-0.52 for other adjacent pairs; and it matches only 4.0% of that year's events under the name-and-broker rule, against 12.1-14.0% for other list years. The in-force rule restores 2018 to 13.4%. Across the sample, 2,774 events (13.2%) have </w:t>
       </w:r>
       <w:r>
         <w:rPr>
@@ -3093,13 +3063,7 @@
         <w:rPr>
           <w:color w:val="000000"/>
         </w:rPr>
-        <w:t>Within each identity, all rating records from 2018 to 2024 are counted. Houses are sorted by this count and cut on the cumulative share of records: the top tier contains houses whose cumulative share, including themselves, does not exceed 50%; the middle tier continues to 90%; the remainder forms the small tier. The result is 13 / 26 / 85 houses out of 124, covering 48.0%, 41.4% and 10.6% of records. Equal thirds are not used because the distribution is highly skewed: the top 42 houses, one third of 124, al</w:t>
-      </w:r>
-      <w:r>
-        <w:rPr>
-          <w:color w:val="000000"/>
-        </w:rPr>
-        <w:t xml:space="preserve">ready account for 91.8% of records. Subsidiaries such as </w:t>
+        <w:t xml:space="preserve">Within each identity, all rating records from 2018 to 2024 are counted. Houses are sorted by this count and cut on the cumulative share of records: the top tier contains houses whose cumulative share, including themselves, does not exceed 50%; the middle tier continues to 90%; the remainder forms the small tier. The result is 13 / 26 / 85 houses out of 124, covering 48.0%, 41.4% and 10.6% of records. Equal thirds are not used because the distribution is highly skewed: the top 42 houses, one third of 124, already account for 91.8% of records. Subsidiaries such as </w:t>
       </w:r>
       <w:r>
         <w:rPr>
@@ -3669,7 +3633,7 @@
         <w:pStyle w:val="21"/>
         <w:spacing w:after="120"/>
       </w:pPr>
-      <w:bookmarkStart w:id="7" w:name="_Toc243236497"/>
+      <w:bookmarkStart w:id="7" w:name="_Toc243237720"/>
       <w:r>
         <w:rPr>
           <w:rFonts w:ascii="Times New Roman" w:eastAsia="Arial" w:hAnsi="Times New Roman"/>
@@ -3776,7 +3740,7 @@
         <w:pStyle w:val="1"/>
         <w:spacing w:before="280" w:after="120"/>
       </w:pPr>
-      <w:bookmarkStart w:id="8" w:name="_Toc243236498"/>
+      <w:bookmarkStart w:id="8" w:name="_Toc243237721"/>
       <w:r>
         <w:rPr>
           <w:rFonts w:ascii="Times New Roman" w:eastAsia="Arial" w:hAnsi="Times New Roman"/>
@@ -3880,19 +3844,7 @@
         <w:rPr>
           <w:color w:val="000000"/>
         </w:rPr>
-        <w:t xml:space="preserve"> Two metrics are used. The first is the direction-adjusted holding-period return: the market-adjusted cumulative total return from the event-day close to the close after 63, 126 or 252 trading days, with upgrades held long and downgrades held short. A positive value indicates that following the recommendation would have been profitable. A window requires at least 80% valid trading days. The second is the analyst's earnings forecast error. Each event is matched to the analyst's own earnings-per-share forecas</w:t>
-      </w:r>
-      <w:r>
-        <w:rPr>
-          <w:color w:val="000000"/>
-        </w:rPr>
-        <w:t>t in the same report on stock, report date, analyst and broker. The error is the absolute difference between the forecast and realised annual basic EPS, divided by the event-day closing price and multiplied by 100. Errors are computed for the report's fiscal year (FY0) and the next fiscal year (FY1), winsorised at the 1st and 99th percentiles, and the signed error is also reported to distinguish optimism from dispersion. The matched sample contains 20,248 events (96.5%); FY0 actual EPS is available for 20,0</w:t>
-      </w:r>
-      <w:r>
-        <w:rPr>
-          <w:color w:val="000000"/>
-        </w:rPr>
-        <w:t>67 events and FY1 for 19,626, after adding the 2025 realised-EPS pull.</w:t>
+        <w:t xml:space="preserve"> Two metrics are used. The first is the direction-adjusted holding-period return: the market-adjusted cumulative total return from the event-day close to the close after 63, 126 or 252 trading days, with upgrades held long and downgrades held short. A positive value indicates that following the recommendation would have been profitable. A window requires at least 80% valid trading days. The second is the analyst's earnings forecast error. Each event is matched to the analyst's own earnings-per-share forecast in the same report on stock, report date, analyst and broker. The error is the absolute difference between the forecast and realised annual basic EPS, divided by the event-day closing price and multiplied by 100. Errors are computed for the report's fiscal year (FY0) and the next fiscal year (FY1), winsorised at the 1st and 99th percentiles, and the signed error is also reported to distinguish optimism from dispersion. The matched sample contains 20,248 events (96.5%); FY0 actual EPS is available for 20,067 events and FY1 for 19,626, after adding the 2025 realised-EPS pull.</w:t>
       </w:r>
     </w:p>
     <w:p>
@@ -3951,7 +3903,7 @@
         <w:pStyle w:val="1"/>
         <w:spacing w:before="280" w:after="120"/>
       </w:pPr>
-      <w:bookmarkStart w:id="9" w:name="_Toc243236499"/>
+      <w:bookmarkStart w:id="9" w:name="_Toc243237722"/>
       <w:r>
         <w:rPr>
           <w:rFonts w:ascii="Times New Roman" w:eastAsia="Arial" w:hAnsi="Times New Roman"/>
@@ -3967,7 +3919,7 @@
         <w:pStyle w:val="21"/>
         <w:spacing w:after="120"/>
       </w:pPr>
-      <w:bookmarkStart w:id="10" w:name="_Toc243236500"/>
+      <w:bookmarkStart w:id="10" w:name="_Toc243237723"/>
       <w:r>
         <w:rPr>
           <w:rFonts w:ascii="Times New Roman" w:eastAsia="Arial" w:hAnsi="Times New Roman"/>
@@ -4476,13 +4428,7 @@
         <w:rPr>
           <w:color w:val="000000"/>
         </w:rPr>
-        <w:t>The upgrade premium is modest but precisely estimated: 0.37 percentage points over the three-day window and 0.99 over the eleven-day window. Abnormal volume is 0.053 log points higher for star upgrades. The same-stock-same-day collapsed variant yields 0.43 (t = 2.51), 0.61 (t = 2.58) and 1.06 (t = 3.81), with abnormal volume at 0.059 (t = 3.19), so the result is not driven by multiple events on the same stock-day. No downgrade window is statistically significant. The upgrade premium is concentrated in event</w:t>
-      </w:r>
-      <w:r>
-        <w:rPr>
-          <w:color w:val="000000"/>
-        </w:rPr>
-        <w:t>s whose window contains a price-limit hit. Excluding those events, the [-1,+1] difference falls from 0.37 to 0.21 (p = 0.134) and the [-1,+5] difference from 0.54 to 0.20 (p = 0.310); the [-5,+5] difference remains 0.65 (p = 0.008).</w:t>
+        <w:t>The upgrade premium is modest but precisely estimated: 0.37 percentage points over the three-day window and 0.99 over the eleven-day window. Abnormal volume is 0.053 log points higher for star upgrades. The same-stock-same-day collapsed variant yields 0.43 (t = 2.51), 0.61 (t = 2.58) and 1.06 (t = 3.81), with abnormal volume at 0.059 (t = 3.19), so the result is not driven by multiple events on the same stock-day. No downgrade window is statistically significant. The upgrade premium is concentrated in events whose window contains a price-limit hit. Excluding those events, the [-1,+1] difference falls from 0.37 to 0.21 (p = 0.134) and the [-1,+5] difference from 0.54 to 0.20 (p = 0.310); the [-5,+5] difference remains 0.65 (p = 0.008).</w:t>
       </w:r>
     </w:p>
     <w:p>
@@ -4563,7 +4509,7 @@
         <w:pStyle w:val="21"/>
         <w:spacing w:after="120"/>
       </w:pPr>
-      <w:bookmarkStart w:id="11" w:name="_Toc243236501"/>
+      <w:bookmarkStart w:id="11" w:name="_Toc243237724"/>
       <w:r>
         <w:rPr>
           <w:rFonts w:ascii="Times New Roman" w:eastAsia="Arial" w:hAnsi="Times New Roman"/>
@@ -5049,7 +4995,7 @@
         <w:pStyle w:val="21"/>
         <w:spacing w:after="120"/>
       </w:pPr>
-      <w:bookmarkStart w:id="12" w:name="_Toc243236502"/>
+      <w:bookmarkStart w:id="12" w:name="_Toc243237725"/>
       <w:r>
         <w:rPr>
           <w:rFonts w:ascii="Times New Roman" w:eastAsia="Arial" w:hAnsi="Times New Roman"/>
@@ -5475,13 +5421,7 @@
         <w:rPr>
           <w:color w:val="000000"/>
         </w:rPr>
-        <w:t>Forecast errors point in the opposite direction. Star analysts' absolute errors are larger in all four cells: FY0 upgrades 2.18 versus 1.89 (difference 0.28, p = 0.002), FY0 downgrades 3.07 versus 2.61 (0.46, p = 0.002), FY1 upgrades 4.49 versus 4.09 (0.40, p = 0.009) and FY1 downgrades 5.72 versus 4.78 (0.94, p &lt; 0.001). Signed errors, which measure optimism, do not differ significantly at either horizon (FY0: 0.15 and 0.18, p = 0.12 and 0.24; FY1: 0.25 and 0.18, p = 0.12 and 0.46). Stars are therefore not</w:t>
-      </w:r>
-      <w:r>
-        <w:rPr>
-          <w:color w:val="000000"/>
-        </w:rPr>
-        <w:t xml:space="preserve"> more optimistic; their forecasts are more dispersed. One explanation is that stars cover harder or more volatile stocks, an uncontrolled selection difference that should not be read as direct evidence of lower ability.</w:t>
+        <w:t>Forecast errors point in the opposite direction. Star analysts' absolute errors are larger in all four cells: FY0 upgrades 2.18 versus 1.89 (difference 0.28, p = 0.002), FY0 downgrades 3.07 versus 2.61 (0.46, p = 0.002), FY1 upgrades 4.49 versus 4.09 (0.40, p = 0.009) and FY1 downgrades 5.72 versus 4.78 (0.94, p &lt; 0.001). Signed errors, which measure optimism, do not differ significantly at either horizon (FY0: 0.15 and 0.18, p = 0.12 and 0.24; FY1: 0.25 and 0.18, p = 0.12 and 0.46). Stars are therefore not more optimistic; their forecasts are more dispersed. One explanation is that stars cover harder or more volatile stocks, an uncontrolled selection difference that should not be read as direct evidence of lower ability.</w:t>
       </w:r>
     </w:p>
     <w:p>
@@ -5549,7 +5489,7 @@
         <w:pStyle w:val="21"/>
         <w:spacing w:after="120"/>
       </w:pPr>
-      <w:bookmarkStart w:id="13" w:name="_Toc243236503"/>
+      <w:bookmarkStart w:id="13" w:name="_Toc243237726"/>
       <w:r>
         <w:rPr>
           <w:rFonts w:ascii="Times New Roman" w:eastAsia="Arial" w:hAnsi="Times New Roman"/>
@@ -5564,13 +5504,7 @@
         <w:rPr>
           <w:color w:val="000000"/>
         </w:rPr>
-        <w:t>The direction asymmetry is robust. In the pooled interaction model, the star premium on upgrades is +0.39 percentage points at [-1,+1] (p = 0.021), and the interaction with the downgrade indicator is -0.29 (p = 0.197). At [-1,+5] the upgrade premium is +0.58 (p = 0.014) and the interaction is -0.70 (p = 0.025). For abnormal volume, the upgrade premium is +0.049 (p = 0.009) and the interaction is -0.057 (p = 0.041). The asymmetry is therefore statistically clear at the five-day window and for volume, and mar</w:t>
-      </w:r>
-      <w:r>
-        <w:rPr>
-          <w:color w:val="000000"/>
-        </w:rPr>
-        <w:t>ginal at the three-day window and at +2 to +120.</w:t>
+        <w:t>The direction asymmetry is robust. In the pooled interaction model, the star premium on upgrades is +0.39 percentage points at [-1,+1] (p = 0.021), and the interaction with the downgrade indicator is -0.29 (p = 0.197). At [-1,+5] the upgrade premium is +0.58 (p = 0.014) and the interaction is -0.70 (p = 0.025). For abnormal volume, the upgrade premium is +0.049 (p = 0.009) and the interaction is -0.057 (p = 0.041). The asymmetry is therefore statistically clear at the five-day window and for volume, and marginal at the three-day window and at +2 to +120.</w:t>
       </w:r>
     </w:p>
     <w:p>
@@ -5578,13 +5512,7 @@
         <w:rPr>
           <w:color w:val="000000"/>
         </w:rPr>
-        <w:t>Tier results are suggestive but not stable. For upgrades, the top-tier star premium is +0.55 at [-1,+1] (p = 0.017), the top-versus-middle difference is -0.63 (p = 0.072), and the middle-tier total effect is -0.08 (p = 0.761). For abnormal volume, the top-tier premium is +0.064 (p = 0.013). For downgrades, the middle-tier total effect is +0.62 (p = 0.007), while the top-tier effect is -0.14 (p = 0.536). The signs differ from the upgrade side, which makes the tier result difficult to interpret as a single au</w:t>
-      </w:r>
-      <w:r>
-        <w:rPr>
-          <w:color w:val="000000"/>
-        </w:rPr>
-        <w:t>thority premium.</w:t>
+        <w:t>Tier results are suggestive but not stable. For upgrades, the top-tier star premium is +0.55 at [-1,+1] (p = 0.017), the top-versus-middle difference is -0.63 (p = 0.072), and the middle-tier total effect is -0.08 (p = 0.761). For abnormal volume, the top-tier premium is +0.064 (p = 0.013). For downgrades, the middle-tier total effect is +0.62 (p = 0.007), while the top-tier effect is -0.14 (p = 0.536). The signs differ from the upgrade side, which makes the tier result difficult to interpret as a single authority premium.</w:t>
       </w:r>
     </w:p>
     <w:p>
@@ -5606,13 +5534,7 @@
         <w:rPr>
           <w:color w:val="000000"/>
         </w:rPr>
-        <w:t xml:space="preserve"> and tier are highly collinear: the small tier contains only two star upgrades and no star downgrades. Second, a backward-looking rolling tier, built from records in the three years before each event, reclassifies 23.1% of events; the asymmetry survives, but the tier coefficients become unstable: the top-tier upgrade premium is +0.49 (p = 0.046), its volume premium +0.042 (p = 0.099), and the middle-tier downgrade effect +0.33 (p = 0.129). Tier results are therefore descriptive, not a separate causal channe</w:t>
-      </w:r>
-      <w:r>
-        <w:rPr>
-          <w:color w:val="000000"/>
-        </w:rPr>
-        <w:t>l.</w:t>
+        <w:t xml:space="preserve"> and tier are highly collinear: the small tier contains only two star upgrades and no star downgrades. Second, a backward-looking rolling tier, built from records in the three years before each event, reclassifies 23.1% of events; the asymmetry survives, but the tier coefficients become unstable: the top-tier upgrade premium is +0.49 (p = 0.046), its volume premium +0.042 (p = 0.099), and the middle-tier downgrade effect +0.33 (p = 0.129). Tier results are therefore descriptive, not a separate causal channel.</w:t>
       </w:r>
     </w:p>
     <w:p>
@@ -5620,7 +5542,7 @@
         <w:pStyle w:val="1"/>
         <w:spacing w:before="280" w:after="120"/>
       </w:pPr>
-      <w:bookmarkStart w:id="14" w:name="_Toc243236504"/>
+      <w:bookmarkStart w:id="14" w:name="_Toc243237727"/>
       <w:r>
         <w:rPr>
           <w:rFonts w:ascii="Times New Roman" w:eastAsia="Arial" w:hAnsi="Times New Roman"/>
@@ -6237,19 +6159,7 @@
         <w:rPr>
           <w:color w:val="000000"/>
         </w:rPr>
-        <w:t xml:space="preserve"> All three analyses are re-estimated with standard errors clustered by stock. The star premium remains significant where it was significant: CAR[-1,+1] 0.37 (p = 0.035), CAR[-1,+5] 0.54 (p = 0.028), CAR[-5,+5] 0.99 (p = 0.0006) and abnormal volume 0.053 (p = 0.006); six-month upgrades 1.51 (p = 0.050) and three-month downgrades 1.78 (p = 0.002); forecast errors FY0 0.28 (p = 0.003) and 0.46 (p = 0.001), FY1 0.40 (p = 0.010) and 0.94 (p &lt; 0.001). No 5% significance conclusion changes. A stock-day clustered v</w:t>
-      </w:r>
-      <w:r>
-        <w:rPr>
-          <w:color w:val="000000"/>
-        </w:rPr>
-        <w:t>ariant yields similar results. Two caveats apply. The six-month upgrade result is marginal after clustering (p = 0.050) and should not be described as a strong result. The FY1 upgrade error is significant only after winsorisation (raw p = 0.060). The clustered tests are not adjusted for multiple specifications. A Bonferroni correction across 30 main specifications (threshold 0.0017) leaves five results significant: upgrade CAR[-5,+5], downgrade three-month holding returns in both raw and market-adjusted for</w:t>
-      </w:r>
-      <w:r>
-        <w:rPr>
-          <w:color w:val="000000"/>
-        </w:rPr>
-        <w:t>m, FY0 downgrade errors and FY1 downgrade errors. Clustering is one-way by stock; a two-way stock-by-date variant is not reported.</w:t>
+        <w:t xml:space="preserve"> All three analyses are re-estimated with standard errors clustered by stock. The star premium remains significant where it was significant: CAR[-1,+1] 0.37 (p = 0.035), CAR[-1,+5] 0.54 (p = 0.028), CAR[-5,+5] 0.99 (p = 0.0006) and abnormal volume 0.053 (p = 0.006); six-month upgrades 1.51 (p = 0.050) and three-month downgrades 1.78 (p = 0.002); forecast errors FY0 0.28 (p = 0.003) and 0.46 (p = 0.001), FY1 0.40 (p = 0.010) and 0.94 (p &lt; 0.001). No 5% significance conclusion changes. A stock-day clustered variant yields similar results. Two caveats apply. The six-month upgrade result is marginal after clustering (p = 0.050) and should not be described as a strong result. The FY1 upgrade error is significant only after winsorisation (raw p = 0.060). The clustered tests are not adjusted for multiple specifications. A Bonferroni correction across 30 main specifications (threshold 0.0017) leaves five results significant: upgrade CAR[-5,+5], downgrade three-month holding returns in both raw and market-adjusted form, FY0 downgrade errors and FY1 downgrade errors. Clustering is one-way by stock; a two-way stock-by-date variant is not reported.</w:t>
       </w:r>
     </w:p>
     <w:p>
@@ -6264,13 +6174,7 @@
         <w:rPr>
           <w:color w:val="000000"/>
         </w:rPr>
-        <w:t xml:space="preserve"> Price-limit hits are identified from daily returns and board-specific thresholds (10% main board, 20% ChiNext and STAR, 30% BSE), excluding the first five trading days and capping at the threshold plus 1.0 percentage point. Dropping events with a limit hit in the window leaves upgrade CAR[-1,+1] at 0.21 (p = 0.134), [-1,+5] at 0.20 (p = 0.310) and [-5,+5] at 0.65 (p = 0.008); downgrades remain insignificant. The premium is concentrated in limit-hit events, and the short-window result should not be describe</w:t>
-      </w:r>
-      <w:r>
-        <w:rPr>
-          <w:color w:val="000000"/>
-        </w:rPr>
-        <w:t>d as robust to price limits.</w:t>
+        <w:t xml:space="preserve"> Price-limit hits are identified from daily returns and board-specific thresholds (10% main board, 20% ChiNext and STAR, 30% BSE), excluding the first five trading days and capping at the threshold plus 1.0 percentage point. Dropping events with a limit hit in the window leaves upgrade CAR[-1,+1] at 0.21 (p = 0.134), [-1,+5] at 0.20 (p = 0.310) and [-5,+5] at 0.65 (p = 0.008); downgrades remain insignificant. The premium is concentrated in limit-hit events, and the short-window result should not be described as robust to price limits.</w:t>
       </w:r>
     </w:p>
     <w:p>
@@ -6331,13 +6235,13 @@
           <w:b/>
           <w:color w:val="000000"/>
         </w:rPr>
-        <w:t>Remaining checks.</w:t>
-      </w:r>
-      <w:r>
-        <w:rPr>
-          <w:color w:val="000000"/>
-        </w:rPr>
-        <w:t xml:space="preserve"> The FY1 forecast-error sample ends with 2023 events; extending it requires 2025 realised EPS.</w:t>
+        <w:t>Sample coverage.</w:t>
+      </w:r>
+      <w:r>
+        <w:rPr>
+          <w:color w:val="000000"/>
+        </w:rPr>
+        <w:t xml:space="preserve"> The FY1 forecast-error sample now includes 2024 events after the 2025 realised-EPS pull; 34 event stocks still lack realised EPS.</w:t>
       </w:r>
     </w:p>
     <w:p>
@@ -6345,7 +6249,7 @@
         <w:pStyle w:val="1"/>
         <w:spacing w:before="280" w:after="120"/>
       </w:pPr>
-      <w:bookmarkStart w:id="15" w:name="_Toc243236505"/>
+      <w:bookmarkStart w:id="15" w:name="_Toc243237728"/>
       <w:r>
         <w:rPr>
           <w:rFonts w:ascii="Times New Roman" w:eastAsia="Arial" w:hAnsi="Times New Roman"/>
@@ -6361,13 +6265,7 @@
         <w:rPr>
           <w:color w:val="000000"/>
         </w:rPr>
-        <w:t>The pattern is consistent with influence, with a short-run information component. Stars generate a larger announcement reaction and more volume, which both explanations predict. The reaction is not followed by a persistent accuracy advantage: star upgrades are better only at six months, star downgrades only at three months, and both advantages disappear by twelve months. Most importantly, star analysts' earnings forecasts are less accurate in absolute terms. If star status primarily signalled superior infor</w:t>
-      </w:r>
-      <w:r>
-        <w:rPr>
-          <w:color w:val="000000"/>
-        </w:rPr>
-        <w:t>mation, the opposite would be expected.</w:t>
+        <w:t>The pattern is consistent with influence, with a short-run information component. Stars generate a larger announcement reaction and more volume, which both explanations predict. The reaction is not followed by a persistent accuracy advantage: star upgrades are better only at six months, star downgrades only at three months, and both advantages disappear by twelve months. Most importantly, star analysts' earnings forecasts are less accurate in absolute terms. If star status primarily signalled superior information, the opposite would be expected.</w:t>
       </w:r>
     </w:p>
     <w:p>
@@ -6383,13 +6281,7 @@
         <w:rPr>
           <w:color w:val="000000"/>
         </w:rPr>
-        <w:t>Career concerns are an alternative mechanism. Analysts who fear damaging their reputation may avoid bold forecasts, herd toward consensus, or issue recommendations that are easy to defend. The data contain two observable proxies, seniority and broker tier. Seniority is censored at the 2009 source floor, and the tier is collinear with star status, so neither supports a clean test. The tier pattern, with the upgrade premium concentrated in top-tier brokers, is consistent with career concerns, but also with la</w:t>
-      </w:r>
-      <w:r>
-        <w:rPr>
-          <w:color w:val="000000"/>
-        </w:rPr>
-        <w:t>rger research teams and better distribution. Career concerns are therefore discussed rather than tested.</w:t>
+        <w:t>Career concerns are an alternative mechanism. Analysts who fear damaging their reputation may avoid bold forecasts, herd toward consensus, or issue recommendations that are easy to defend. The data contain two observable proxies, seniority and broker tier. Seniority is censored at the 2009 source floor, and the tier is collinear with star status, so neither supports a clean test. The tier pattern, with the upgrade premium concentrated in top-tier brokers, is consistent with career concerns, but also with larger research teams and better distribution. Career concerns are therefore discussed rather than tested.</w:t>
       </w:r>
     </w:p>
     <w:p>
@@ -6405,7 +6297,7 @@
         <w:pStyle w:val="1"/>
         <w:spacing w:before="280" w:after="120"/>
       </w:pPr>
-      <w:bookmarkStart w:id="16" w:name="_Toc243236506"/>
+      <w:bookmarkStart w:id="16" w:name="_Toc243237729"/>
       <w:r>
         <w:rPr>
           <w:rFonts w:ascii="Times New Roman" w:eastAsia="Arial" w:hAnsi="Times New Roman"/>
@@ -6421,13 +6313,7 @@
         <w:rPr>
           <w:color w:val="000000"/>
         </w:rPr>
-        <w:t>Three limitations qualify the interpretation. First, star status is not randomly assigned, and the broker tier is a descriptive proxy constructed from rating records and highly collinear with star; the estimates describe associations, not causal effects. Second, standard errors are clustered by stock for the main tests, but the tests are not adjusted for multiple specifications and a two-way stock-by-date variant is not reported; the announcement premium is concentrated in price-limit events, and historical</w:t>
-      </w:r>
-      <w:r>
-        <w:rPr>
-          <w:color w:val="000000"/>
-        </w:rPr>
-        <w:t xml:space="preserve"> ST status is proxied rather than observed. Third, the data have known gaps: iFinD provides neither historical ST status nor research-line revenue; the 2018 New Fortune page is not an annual ranking, so 2018 inherits the 2017 list; and the FY1 forecast-error sample ends with 2023 events because 2025 realised EPS is outside the current pull.</w:t>
+        <w:t>Three limitations qualify the interpretation. First, star status is not randomly assigned, and the broker tier is a descriptive proxy constructed from rating records and highly collinear with star; the estimates describe associations, not causal effects. Second, standard errors are clustered by stock for the main tests, but the tests are not adjusted for multiple specifications and a two-way stock-by-date variant is not reported; the announcement premium is concentrated in price-limit events, and historical ST status is proxied rather than observed. Third, the data have known gaps: iFinD provides neither historical ST status nor research-line revenue; the 2018 New Fortune page is not an annual ranking, so 2018 inherits the 2017 list; and 34 event stocks lack realised EPS. The FY1 forecast-error sample now includes 2024 events after the 2025 realised-EPS pull.</w:t>
       </w:r>
     </w:p>
     <w:p>
@@ -6435,7 +6321,7 @@
         <w:pStyle w:val="1"/>
         <w:spacing w:before="280" w:after="120"/>
       </w:pPr>
-      <w:bookmarkStart w:id="17" w:name="_Toc243236507"/>
+      <w:bookmarkStart w:id="17" w:name="_Toc243237730"/>
       <w:r>
         <w:rPr>
           <w:rFonts w:ascii="Times New Roman" w:eastAsia="Arial" w:hAnsi="Times New Roman"/>
@@ -6451,13 +6337,7 @@
         <w:rPr>
           <w:color w:val="000000"/>
         </w:rPr>
-        <w:t>Star analyst recommendations have market impact, but the impact is not matched by a stable accuracy advantage. Star upgrades generate larger announcement returns and abnormal volume; star downgrades do not, and the upgrade premium is concentrated in price-limit events. Star downgrades are followed by short-run underperformance and later reversal, while star upgrades show no differential drift. Holding returns favour stars only at short horizons, and star earnings forecasts are less accurate in absolute term</w:t>
-      </w:r>
-      <w:r>
-        <w:rPr>
-          <w:color w:val="000000"/>
-        </w:rPr>
-        <w:t>s. The evidence is closer to the influence explanation than to a stable information explanation, with a short-run information component that does not persist.</w:t>
+        <w:t>Star analyst recommendations have market impact, but the impact is not matched by a stable accuracy advantage. Star upgrades generate larger announcement returns and abnormal volume; star downgrades do not, and the upgrade premium is concentrated in price-limit events. Star downgrades are followed by short-run underperformance and later reversal, while star upgrades show no differential drift. Holding returns favour stars only at short horizons, and star earnings forecasts are less accurate in absolute terms. The evidence is closer to the influence explanation than to a stable information explanation, with a short-run information component that does not persist.</w:t>
       </w:r>
     </w:p>
     <w:p>
@@ -6465,7 +6345,7 @@
         <w:pStyle w:val="1"/>
         <w:spacing w:before="280" w:after="120"/>
       </w:pPr>
-      <w:bookmarkStart w:id="18" w:name="_Toc243236508"/>
+      <w:bookmarkStart w:id="18" w:name="_Toc243237731"/>
       <w:r>
         <w:rPr>
           <w:rFonts w:ascii="Times New Roman" w:eastAsia="Arial" w:hAnsi="Times New Roman"/>
@@ -6703,7 +6583,7 @@
         <w:pStyle w:val="1"/>
         <w:spacing w:before="280" w:after="120"/>
       </w:pPr>
-      <w:bookmarkStart w:id="19" w:name="_Toc243236509"/>
+      <w:bookmarkStart w:id="19" w:name="_Toc243237732"/>
       <w:r>
         <w:rPr>
           <w:rFonts w:ascii="Times New Roman" w:eastAsia="Arial" w:hAnsi="Times New Roman"/>
@@ -7101,7 +6981,7 @@
         <w:pStyle w:val="1"/>
         <w:spacing w:before="280" w:after="120"/>
       </w:pPr>
-      <w:bookmarkStart w:id="20" w:name="_Toc243236510"/>
+      <w:bookmarkStart w:id="20" w:name="_Toc243237733"/>
       <w:r>
         <w:rPr>
           <w:rFonts w:ascii="Times New Roman" w:eastAsia="Arial" w:hAnsi="Times New Roman"/>
@@ -7549,7 +7429,7 @@
         <w:rPr>
           <w:color w:val="000000"/>
         </w:rPr>
-        <w:t>Known gaps are documented in Section 8. In brief, iFinD does not provide historical ST status or a research-line revenue panel, the 2018 New Fortune page is not an annual ranking, 34 event stocks lack realised EPS, and the FY1 forecast-error sample ends with 2023 events.</w:t>
+        <w:t>Known gaps are documented in Section 8. In brief, iFinD does not provide historical ST status or a research-line revenue panel, the 2018 New Fortune page is not an annual ranking, and 34 event stocks lack realised EPS. The FY1 forecast-error sample now includes 2024 events after the 2025 realised-EPS pull.</w:t>
       </w:r>
     </w:p>
     <w:sectPr>

</xml_diff>